<commit_message>
Jobsheet 4 (Langkah 2 – Membuat Catch-All Route)
</commit_message>
<xml_diff>
--- a/Laporan/20_Satrio Wisnu Adi Pratama_Jobsheet 4.docx
+++ b/Laporan/20_Satrio Wisnu Adi Pratama_Jobsheet 4.docx
@@ -95,7 +95,7 @@
           </mc:Choice>
           <mc:Fallback>
             <w:pict>
-              <v:shape w14:anchorId="42E38B72" id="Graphic 7" o:spid="_x0000_s1026" style="position:absolute;margin-left:56.7pt;margin-top:55.9pt;width:481.9pt;height:.1pt;z-index:251658240;visibility:visible;mso-wrap-style:square;mso-wrap-distance-left:0;mso-wrap-distance-top:0;mso-wrap-distance-right:0;mso-wrap-distance-bottom:0;mso-position-horizontal:absolute;mso-position-horizontal-relative:page;mso-position-vertical:absolute;mso-position-vertical-relative:text;v-text-anchor:top" coordsize="6120130,1270" o:gfxdata="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" path="m,l6120130,e" filled="f" strokeweight=".5pt">
+              <v:shape w14:anchorId="456E03BA" id="Graphic 7" o:spid="_x0000_s1026" style="position:absolute;margin-left:56.7pt;margin-top:55.9pt;width:481.9pt;height:.1pt;z-index:251658240;visibility:visible;mso-wrap-style:square;mso-wrap-distance-left:0;mso-wrap-distance-top:0;mso-wrap-distance-right:0;mso-wrap-distance-bottom:0;mso-position-horizontal:absolute;mso-position-horizontal-relative:page;mso-position-vertical:absolute;mso-position-vertical-relative:text;v-text-anchor:top" coordsize="6120130,1270" o:gfxdata="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" path="m,l6120130,e" filled="f" strokeweight=".5pt">
                 <v:path arrowok="t"/>
                 <w10:wrap anchorx="page"/>
               </v:shape>
@@ -648,6 +648,9 @@
           </w:p>
           <w:p>
             <w:r>
+              <w:rPr>
+                <w:noProof/>
+              </w:rPr>
               <w:drawing>
                 <wp:anchor distT="0" distB="0" distL="114300" distR="114300" simplePos="0" relativeHeight="251658752" behindDoc="0" locked="0" layoutInCell="1" allowOverlap="1" wp14:anchorId="4F6C70A4" wp14:editId="5F129E2C">
                   <wp:simplePos x="0" y="0"/>
@@ -751,6 +754,9 @@
           </w:p>
           <w:p>
             <w:r>
+              <w:rPr>
+                <w:noProof/>
+              </w:rPr>
               <w:drawing>
                 <wp:inline distT="0" distB="0" distL="0" distR="0" wp14:anchorId="6F3B0042" wp14:editId="75FCFF09">
                   <wp:extent cx="4233545" cy="660216"/>
@@ -845,6 +851,9 @@
           </w:p>
           <w:p>
             <w:r>
+              <w:rPr>
+                <w:noProof/>
+              </w:rPr>
               <w:drawing>
                 <wp:inline distT="0" distB="0" distL="0" distR="0" wp14:anchorId="0CAA3B05" wp14:editId="651E3527">
                   <wp:extent cx="4233545" cy="1716805"/>
@@ -915,8 +924,6 @@
       <w:pPr>
         <w:ind w:left="144"/>
       </w:pPr>
-      <w:bookmarkStart w:id="0" w:name="_GoBack"/>
-      <w:bookmarkEnd w:id="0"/>
     </w:p>
     <w:p>
       <w:pPr>
@@ -1038,6 +1045,45 @@
               <w:t>Buat folder shop dan file […slug].tsx:</w:t>
             </w:r>
           </w:p>
+          <w:p>
+            <w:r>
+              <w:drawing>
+                <wp:inline distT="0" distB="0" distL="0" distR="0" wp14:anchorId="668D4495" wp14:editId="548CE7D0">
+                  <wp:extent cx="3124636" cy="552527"/>
+                  <wp:effectExtent l="0" t="0" r="0" b="0"/>
+                  <wp:docPr id="8" name="Picture 8"/>
+                  <wp:cNvGraphicFramePr>
+                    <a:graphicFrameLocks xmlns:a="http://schemas.openxmlformats.org/drawingml/2006/main" noChangeAspect="1"/>
+                  </wp:cNvGraphicFramePr>
+                  <a:graphic xmlns:a="http://schemas.openxmlformats.org/drawingml/2006/main">
+                    <a:graphicData uri="http://schemas.openxmlformats.org/drawingml/2006/picture">
+                      <pic:pic xmlns:pic="http://schemas.openxmlformats.org/drawingml/2006/picture">
+                        <pic:nvPicPr>
+                          <pic:cNvPr id="1" name=""/>
+                          <pic:cNvPicPr/>
+                        </pic:nvPicPr>
+                        <pic:blipFill>
+                          <a:blip r:embed="rId11"/>
+                          <a:stretch>
+                            <a:fillRect/>
+                          </a:stretch>
+                        </pic:blipFill>
+                        <pic:spPr>
+                          <a:xfrm>
+                            <a:off x="0" y="0"/>
+                            <a:ext cx="3124636" cy="552527"/>
+                          </a:xfrm>
+                          <a:prstGeom prst="rect">
+                            <a:avLst/>
+                          </a:prstGeom>
+                        </pic:spPr>
+                      </pic:pic>
+                    </a:graphicData>
+                  </a:graphic>
+                </wp:inline>
+              </w:drawing>
+            </w:r>
+          </w:p>
         </w:tc>
       </w:tr>
       <w:tr>
@@ -1065,8 +1111,49 @@
           </w:p>
           <w:p>
             <w:r>
+              <w:drawing>
+                <wp:inline distT="0" distB="0" distL="0" distR="0" wp14:anchorId="607C2CD5" wp14:editId="6C74C881">
+                  <wp:extent cx="3149699" cy="2019174"/>
+                  <wp:effectExtent l="0" t="0" r="0" b="635"/>
+                  <wp:docPr id="9" name="Picture 9"/>
+                  <wp:cNvGraphicFramePr>
+                    <a:graphicFrameLocks xmlns:a="http://schemas.openxmlformats.org/drawingml/2006/main" noChangeAspect="1"/>
+                  </wp:cNvGraphicFramePr>
+                  <a:graphic xmlns:a="http://schemas.openxmlformats.org/drawingml/2006/main">
+                    <a:graphicData uri="http://schemas.openxmlformats.org/drawingml/2006/picture">
+                      <pic:pic xmlns:pic="http://schemas.openxmlformats.org/drawingml/2006/picture">
+                        <pic:nvPicPr>
+                          <pic:cNvPr id="1" name=""/>
+                          <pic:cNvPicPr/>
+                        </pic:nvPicPr>
+                        <pic:blipFill>
+                          <a:blip r:embed="rId12"/>
+                          <a:stretch>
+                            <a:fillRect/>
+                          </a:stretch>
+                        </pic:blipFill>
+                        <pic:spPr>
+                          <a:xfrm>
+                            <a:off x="0" y="0"/>
+                            <a:ext cx="3194983" cy="2048204"/>
+                          </a:xfrm>
+                          <a:prstGeom prst="rect">
+                            <a:avLst/>
+                          </a:prstGeom>
+                        </pic:spPr>
+                      </pic:pic>
+                    </a:graphicData>
+                  </a:graphic>
+                </wp:inline>
+              </w:drawing>
+            </w:r>
+          </w:p>
+          <w:p>
+            <w:r>
               <w:t xml:space="preserve">Cek menggunakan console.log apakah nilai segment berhasil didapat </w:t>
             </w:r>
+            <w:bookmarkStart w:id="0" w:name="_GoBack"/>
+            <w:bookmarkEnd w:id="0"/>
           </w:p>
           <w:p>
             <w:pPr>
@@ -1083,6 +1170,49 @@
           <w:p>
             <w:pPr>
               <w:pStyle w:val="ListParagraph"/>
+              <w:ind w:left="720"/>
+            </w:pPr>
+            <w:r>
+              <w:drawing>
+                <wp:inline distT="0" distB="0" distL="0" distR="0" wp14:anchorId="11C0041F" wp14:editId="7F3D15DE">
+                  <wp:extent cx="2971799" cy="1351834"/>
+                  <wp:effectExtent l="0" t="0" r="635" b="1270"/>
+                  <wp:docPr id="10" name="Picture 10"/>
+                  <wp:cNvGraphicFramePr>
+                    <a:graphicFrameLocks xmlns:a="http://schemas.openxmlformats.org/drawingml/2006/main" noChangeAspect="1"/>
+                  </wp:cNvGraphicFramePr>
+                  <a:graphic xmlns:a="http://schemas.openxmlformats.org/drawingml/2006/main">
+                    <a:graphicData uri="http://schemas.openxmlformats.org/drawingml/2006/picture">
+                      <pic:pic xmlns:pic="http://schemas.openxmlformats.org/drawingml/2006/picture">
+                        <pic:nvPicPr>
+                          <pic:cNvPr id="1" name=""/>
+                          <pic:cNvPicPr/>
+                        </pic:nvPicPr>
+                        <pic:blipFill>
+                          <a:blip r:embed="rId13"/>
+                          <a:stretch>
+                            <a:fillRect/>
+                          </a:stretch>
+                        </pic:blipFill>
+                        <pic:spPr>
+                          <a:xfrm>
+                            <a:off x="0" y="0"/>
+                            <a:ext cx="3009228" cy="1368860"/>
+                          </a:xfrm>
+                          <a:prstGeom prst="rect">
+                            <a:avLst/>
+                          </a:prstGeom>
+                        </pic:spPr>
+                      </pic:pic>
+                    </a:graphicData>
+                  </a:graphic>
+                </wp:inline>
+              </w:drawing>
+            </w:r>
+          </w:p>
+          <w:p>
+            <w:pPr>
+              <w:pStyle w:val="ListParagraph"/>
               <w:numPr>
                 <w:ilvl w:val="0"/>
                 <w:numId w:val="6"/>
@@ -1091,6 +1221,12 @@
             <w:r>
               <w:t xml:space="preserve">Cek Vscode jika pada console.log dapat menampilkan nilai querynya berarti berhasil </w:t>
             </w:r>
+          </w:p>
+          <w:p>
+            <w:pPr>
+              <w:pStyle w:val="ListParagraph"/>
+              <w:ind w:left="720"/>
+            </w:pPr>
           </w:p>
           <w:p>
             <w:pPr>
@@ -1259,6 +1395,7 @@
               </w:numPr>
             </w:pPr>
             <w:r>
+              <w:lastRenderedPageBreak/>
               <w:t>Isi halaman berubah sesuai URL</w:t>
             </w:r>
           </w:p>
@@ -1785,7 +1922,6 @@
           <w:rFonts w:ascii="Times New Roman" w:hAnsi="Times New Roman" w:cs="Times New Roman"/>
           <w:color w:val="auto"/>
         </w:rPr>
-        <w:lastRenderedPageBreak/>
         <w:t>Langkah 6 – Membuat Halaman Login &amp; Register</w:t>
       </w:r>
     </w:p>
@@ -2611,7 +2747,6 @@
               <w:jc w:val="center"/>
             </w:pPr>
             <w:r>
-              <w:lastRenderedPageBreak/>
               <w:t>3</w:t>
             </w:r>
           </w:p>
@@ -2668,8 +2803,8 @@
       </w:pPr>
     </w:p>
     <w:sectPr>
-      <w:headerReference w:type="default" r:id="rId11"/>
-      <w:footerReference w:type="default" r:id="rId12"/>
+      <w:headerReference w:type="default" r:id="rId14"/>
+      <w:footerReference w:type="default" r:id="rId15"/>
       <w:pgSz w:w="11900" w:h="16820"/>
       <w:pgMar w:top="2080" w:right="1133" w:bottom="1060" w:left="992" w:header="567" w:footer="753" w:gutter="0"/>
       <w:cols w:space="720"/>
@@ -2779,7 +2914,7 @@
         </mc:Choice>
         <mc:Fallback>
           <w:pict>
-            <v:shape w14:anchorId="5F4FF21D" id="Graphic 58" o:spid="_x0000_s1026" style="position:absolute;margin-left:56.7pt;margin-top:784.15pt;width:481.9pt;height:.1pt;z-index:-251643904;visibility:visible;mso-wrap-style:square;mso-wrap-distance-left:0;mso-wrap-distance-top:0;mso-wrap-distance-right:0;mso-wrap-distance-bottom:0;mso-position-horizontal:absolute;mso-position-horizontal-relative:page;mso-position-vertical:absolute;mso-position-vertical-relative:page;v-text-anchor:top" coordsize="6120130,1270" o:gfxdata="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" path="m,l6120130,e" filled="f">
+            <v:shape w14:anchorId="459585D8" id="Graphic 58" o:spid="_x0000_s1026" style="position:absolute;margin-left:56.7pt;margin-top:784.15pt;width:481.9pt;height:.1pt;z-index:-251643904;visibility:visible;mso-wrap-style:square;mso-wrap-distance-left:0;mso-wrap-distance-top:0;mso-wrap-distance-right:0;mso-wrap-distance-bottom:0;mso-position-horizontal:absolute;mso-position-horizontal-relative:page;mso-position-vertical:absolute;mso-position-vertical-relative:page;v-text-anchor:top" coordsize="6120130,1270" o:gfxdata="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" path="m,l6120130,e" filled="f">
               <v:path arrowok="t"/>
               <w10:wrap anchorx="page" anchory="page"/>
             </v:shape>
@@ -3384,7 +3519,7 @@
         </mc:Choice>
         <mc:Fallback>
           <w:pict>
-            <v:shape w14:anchorId="4A9C1083" id="Graphic 56" o:spid="_x0000_s1026" style="position:absolute;margin-left:56.7pt;margin-top:103.65pt;width:481.9pt;height:.1pt;z-index:-251645952;visibility:visible;mso-wrap-style:square;mso-wrap-distance-left:0;mso-wrap-distance-top:0;mso-wrap-distance-right:0;mso-wrap-distance-bottom:0;mso-position-horizontal:absolute;mso-position-horizontal-relative:page;mso-position-vertical:absolute;mso-position-vertical-relative:page;v-text-anchor:top" coordsize="6120130,1270" o:gfxdata="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" path="m,l6120130,e" filled="f" strokeweight="1.5pt">
+            <v:shape w14:anchorId="4EB58100" id="Graphic 56" o:spid="_x0000_s1026" style="position:absolute;margin-left:56.7pt;margin-top:103.65pt;width:481.9pt;height:.1pt;z-index:-251645952;visibility:visible;mso-wrap-style:square;mso-wrap-distance-left:0;mso-wrap-distance-top:0;mso-wrap-distance-right:0;mso-wrap-distance-bottom:0;mso-position-horizontal:absolute;mso-position-horizontal-relative:page;mso-position-vertical:absolute;mso-position-vertical-relative:page;v-text-anchor:top" coordsize="6120130,1270" o:gfxdata="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" path="m,l6120130,e" filled="f" strokeweight="1.5pt">
               <v:path arrowok="t"/>
               <w10:wrap anchorx="page" anchory="page"/>
             </v:shape>

</xml_diff>

<commit_message>
Langkah 2 – Membuat Catch-All Route
</commit_message>
<xml_diff>
--- a/Laporan/20_Satrio Wisnu Adi Pratama_Jobsheet 4.docx
+++ b/Laporan/20_Satrio Wisnu Adi Pratama_Jobsheet 4.docx
@@ -95,7 +95,7 @@
           </mc:Choice>
           <mc:Fallback>
             <w:pict>
-              <v:shape w14:anchorId="42E38B72" id="Graphic 7" o:spid="_x0000_s1026" style="position:absolute;margin-left:56.7pt;margin-top:55.9pt;width:481.9pt;height:.1pt;z-index:251658240;visibility:visible;mso-wrap-style:square;mso-wrap-distance-left:0;mso-wrap-distance-top:0;mso-wrap-distance-right:0;mso-wrap-distance-bottom:0;mso-position-horizontal:absolute;mso-position-horizontal-relative:page;mso-position-vertical:absolute;mso-position-vertical-relative:text;v-text-anchor:top" coordsize="6120130,1270" o:gfxdata="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" path="m,l6120130,e" filled="f" strokeweight=".5pt">
+              <v:shape w14:anchorId="456E03BA" id="Graphic 7" o:spid="_x0000_s1026" style="position:absolute;margin-left:56.7pt;margin-top:55.9pt;width:481.9pt;height:.1pt;z-index:251658240;visibility:visible;mso-wrap-style:square;mso-wrap-distance-left:0;mso-wrap-distance-top:0;mso-wrap-distance-right:0;mso-wrap-distance-bottom:0;mso-position-horizontal:absolute;mso-position-horizontal-relative:page;mso-position-vertical:absolute;mso-position-vertical-relative:text;v-text-anchor:top" coordsize="6120130,1270" o:gfxdata="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" path="m,l6120130,e" filled="f" strokeweight=".5pt">
                 <v:path arrowok="t"/>
                 <w10:wrap anchorx="page"/>
               </v:shape>
@@ -648,6 +648,9 @@
           </w:p>
           <w:p>
             <w:r>
+              <w:rPr>
+                <w:noProof/>
+              </w:rPr>
               <w:drawing>
                 <wp:anchor distT="0" distB="0" distL="114300" distR="114300" simplePos="0" relativeHeight="251658752" behindDoc="0" locked="0" layoutInCell="1" allowOverlap="1" wp14:anchorId="4F6C70A4" wp14:editId="5F129E2C">
                   <wp:simplePos x="0" y="0"/>
@@ -751,6 +754,9 @@
           </w:p>
           <w:p>
             <w:r>
+              <w:rPr>
+                <w:noProof/>
+              </w:rPr>
               <w:drawing>
                 <wp:inline distT="0" distB="0" distL="0" distR="0" wp14:anchorId="6F3B0042" wp14:editId="75FCFF09">
                   <wp:extent cx="4233545" cy="660216"/>
@@ -845,6 +851,9 @@
           </w:p>
           <w:p>
             <w:r>
+              <w:rPr>
+                <w:noProof/>
+              </w:rPr>
               <w:drawing>
                 <wp:inline distT="0" distB="0" distL="0" distR="0" wp14:anchorId="0CAA3B05" wp14:editId="651E3527">
                   <wp:extent cx="4233545" cy="1716805"/>
@@ -915,8 +924,6 @@
       <w:pPr>
         <w:ind w:left="144"/>
       </w:pPr>
-      <w:bookmarkStart w:id="0" w:name="_GoBack"/>
-      <w:bookmarkEnd w:id="0"/>
     </w:p>
     <w:p>
       <w:pPr>
@@ -1038,6 +1045,45 @@
               <w:t>Buat folder shop dan file […slug].tsx:</w:t>
             </w:r>
           </w:p>
+          <w:p>
+            <w:r>
+              <w:drawing>
+                <wp:inline distT="0" distB="0" distL="0" distR="0" wp14:anchorId="668D4495" wp14:editId="548CE7D0">
+                  <wp:extent cx="3124636" cy="552527"/>
+                  <wp:effectExtent l="0" t="0" r="0" b="0"/>
+                  <wp:docPr id="8" name="Picture 8"/>
+                  <wp:cNvGraphicFramePr>
+                    <a:graphicFrameLocks xmlns:a="http://schemas.openxmlformats.org/drawingml/2006/main" noChangeAspect="1"/>
+                  </wp:cNvGraphicFramePr>
+                  <a:graphic xmlns:a="http://schemas.openxmlformats.org/drawingml/2006/main">
+                    <a:graphicData uri="http://schemas.openxmlformats.org/drawingml/2006/picture">
+                      <pic:pic xmlns:pic="http://schemas.openxmlformats.org/drawingml/2006/picture">
+                        <pic:nvPicPr>
+                          <pic:cNvPr id="1" name=""/>
+                          <pic:cNvPicPr/>
+                        </pic:nvPicPr>
+                        <pic:blipFill>
+                          <a:blip r:embed="rId11"/>
+                          <a:stretch>
+                            <a:fillRect/>
+                          </a:stretch>
+                        </pic:blipFill>
+                        <pic:spPr>
+                          <a:xfrm>
+                            <a:off x="0" y="0"/>
+                            <a:ext cx="3124636" cy="552527"/>
+                          </a:xfrm>
+                          <a:prstGeom prst="rect">
+                            <a:avLst/>
+                          </a:prstGeom>
+                        </pic:spPr>
+                      </pic:pic>
+                    </a:graphicData>
+                  </a:graphic>
+                </wp:inline>
+              </w:drawing>
+            </w:r>
+          </w:p>
         </w:tc>
       </w:tr>
       <w:tr>
@@ -1065,8 +1111,49 @@
           </w:p>
           <w:p>
             <w:r>
+              <w:drawing>
+                <wp:inline distT="0" distB="0" distL="0" distR="0" wp14:anchorId="607C2CD5" wp14:editId="6C74C881">
+                  <wp:extent cx="3149699" cy="2019174"/>
+                  <wp:effectExtent l="0" t="0" r="0" b="635"/>
+                  <wp:docPr id="9" name="Picture 9"/>
+                  <wp:cNvGraphicFramePr>
+                    <a:graphicFrameLocks xmlns:a="http://schemas.openxmlformats.org/drawingml/2006/main" noChangeAspect="1"/>
+                  </wp:cNvGraphicFramePr>
+                  <a:graphic xmlns:a="http://schemas.openxmlformats.org/drawingml/2006/main">
+                    <a:graphicData uri="http://schemas.openxmlformats.org/drawingml/2006/picture">
+                      <pic:pic xmlns:pic="http://schemas.openxmlformats.org/drawingml/2006/picture">
+                        <pic:nvPicPr>
+                          <pic:cNvPr id="1" name=""/>
+                          <pic:cNvPicPr/>
+                        </pic:nvPicPr>
+                        <pic:blipFill>
+                          <a:blip r:embed="rId12"/>
+                          <a:stretch>
+                            <a:fillRect/>
+                          </a:stretch>
+                        </pic:blipFill>
+                        <pic:spPr>
+                          <a:xfrm>
+                            <a:off x="0" y="0"/>
+                            <a:ext cx="3194983" cy="2048204"/>
+                          </a:xfrm>
+                          <a:prstGeom prst="rect">
+                            <a:avLst/>
+                          </a:prstGeom>
+                        </pic:spPr>
+                      </pic:pic>
+                    </a:graphicData>
+                  </a:graphic>
+                </wp:inline>
+              </w:drawing>
+            </w:r>
+          </w:p>
+          <w:p>
+            <w:r>
               <w:t xml:space="preserve">Cek menggunakan console.log apakah nilai segment berhasil didapat </w:t>
             </w:r>
+            <w:bookmarkStart w:id="0" w:name="_GoBack"/>
+            <w:bookmarkEnd w:id="0"/>
           </w:p>
           <w:p>
             <w:pPr>
@@ -1083,6 +1170,49 @@
           <w:p>
             <w:pPr>
               <w:pStyle w:val="ListParagraph"/>
+              <w:ind w:left="720"/>
+            </w:pPr>
+            <w:r>
+              <w:drawing>
+                <wp:inline distT="0" distB="0" distL="0" distR="0" wp14:anchorId="11C0041F" wp14:editId="7F3D15DE">
+                  <wp:extent cx="2971799" cy="1351834"/>
+                  <wp:effectExtent l="0" t="0" r="635" b="1270"/>
+                  <wp:docPr id="10" name="Picture 10"/>
+                  <wp:cNvGraphicFramePr>
+                    <a:graphicFrameLocks xmlns:a="http://schemas.openxmlformats.org/drawingml/2006/main" noChangeAspect="1"/>
+                  </wp:cNvGraphicFramePr>
+                  <a:graphic xmlns:a="http://schemas.openxmlformats.org/drawingml/2006/main">
+                    <a:graphicData uri="http://schemas.openxmlformats.org/drawingml/2006/picture">
+                      <pic:pic xmlns:pic="http://schemas.openxmlformats.org/drawingml/2006/picture">
+                        <pic:nvPicPr>
+                          <pic:cNvPr id="1" name=""/>
+                          <pic:cNvPicPr/>
+                        </pic:nvPicPr>
+                        <pic:blipFill>
+                          <a:blip r:embed="rId13"/>
+                          <a:stretch>
+                            <a:fillRect/>
+                          </a:stretch>
+                        </pic:blipFill>
+                        <pic:spPr>
+                          <a:xfrm>
+                            <a:off x="0" y="0"/>
+                            <a:ext cx="3009228" cy="1368860"/>
+                          </a:xfrm>
+                          <a:prstGeom prst="rect">
+                            <a:avLst/>
+                          </a:prstGeom>
+                        </pic:spPr>
+                      </pic:pic>
+                    </a:graphicData>
+                  </a:graphic>
+                </wp:inline>
+              </w:drawing>
+            </w:r>
+          </w:p>
+          <w:p>
+            <w:pPr>
+              <w:pStyle w:val="ListParagraph"/>
               <w:numPr>
                 <w:ilvl w:val="0"/>
                 <w:numId w:val="6"/>
@@ -1091,6 +1221,12 @@
             <w:r>
               <w:t xml:space="preserve">Cek Vscode jika pada console.log dapat menampilkan nilai querynya berarti berhasil </w:t>
             </w:r>
+          </w:p>
+          <w:p>
+            <w:pPr>
+              <w:pStyle w:val="ListParagraph"/>
+              <w:ind w:left="720"/>
+            </w:pPr>
           </w:p>
           <w:p>
             <w:pPr>
@@ -1259,6 +1395,7 @@
               </w:numPr>
             </w:pPr>
             <w:r>
+              <w:lastRenderedPageBreak/>
               <w:t>Isi halaman berubah sesuai URL</w:t>
             </w:r>
           </w:p>
@@ -1785,7 +1922,6 @@
           <w:rFonts w:ascii="Times New Roman" w:hAnsi="Times New Roman" w:cs="Times New Roman"/>
           <w:color w:val="auto"/>
         </w:rPr>
-        <w:lastRenderedPageBreak/>
         <w:t>Langkah 6 – Membuat Halaman Login &amp; Register</w:t>
       </w:r>
     </w:p>
@@ -2611,7 +2747,6 @@
               <w:jc w:val="center"/>
             </w:pPr>
             <w:r>
-              <w:lastRenderedPageBreak/>
               <w:t>3</w:t>
             </w:r>
           </w:p>
@@ -2668,8 +2803,8 @@
       </w:pPr>
     </w:p>
     <w:sectPr>
-      <w:headerReference w:type="default" r:id="rId11"/>
-      <w:footerReference w:type="default" r:id="rId12"/>
+      <w:headerReference w:type="default" r:id="rId14"/>
+      <w:footerReference w:type="default" r:id="rId15"/>
       <w:pgSz w:w="11900" w:h="16820"/>
       <w:pgMar w:top="2080" w:right="1133" w:bottom="1060" w:left="992" w:header="567" w:footer="753" w:gutter="0"/>
       <w:cols w:space="720"/>
@@ -2779,7 +2914,7 @@
         </mc:Choice>
         <mc:Fallback>
           <w:pict>
-            <v:shape w14:anchorId="5F4FF21D" id="Graphic 58" o:spid="_x0000_s1026" style="position:absolute;margin-left:56.7pt;margin-top:784.15pt;width:481.9pt;height:.1pt;z-index:-251643904;visibility:visible;mso-wrap-style:square;mso-wrap-distance-left:0;mso-wrap-distance-top:0;mso-wrap-distance-right:0;mso-wrap-distance-bottom:0;mso-position-horizontal:absolute;mso-position-horizontal-relative:page;mso-position-vertical:absolute;mso-position-vertical-relative:page;v-text-anchor:top" coordsize="6120130,1270" o:gfxdata="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" path="m,l6120130,e" filled="f">
+            <v:shape w14:anchorId="459585D8" id="Graphic 58" o:spid="_x0000_s1026" style="position:absolute;margin-left:56.7pt;margin-top:784.15pt;width:481.9pt;height:.1pt;z-index:-251643904;visibility:visible;mso-wrap-style:square;mso-wrap-distance-left:0;mso-wrap-distance-top:0;mso-wrap-distance-right:0;mso-wrap-distance-bottom:0;mso-position-horizontal:absolute;mso-position-horizontal-relative:page;mso-position-vertical:absolute;mso-position-vertical-relative:page;v-text-anchor:top" coordsize="6120130,1270" o:gfxdata="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" path="m,l6120130,e" filled="f">
               <v:path arrowok="t"/>
               <w10:wrap anchorx="page" anchory="page"/>
             </v:shape>
@@ -3384,7 +3519,7 @@
         </mc:Choice>
         <mc:Fallback>
           <w:pict>
-            <v:shape w14:anchorId="4A9C1083" id="Graphic 56" o:spid="_x0000_s1026" style="position:absolute;margin-left:56.7pt;margin-top:103.65pt;width:481.9pt;height:.1pt;z-index:-251645952;visibility:visible;mso-wrap-style:square;mso-wrap-distance-left:0;mso-wrap-distance-top:0;mso-wrap-distance-right:0;mso-wrap-distance-bottom:0;mso-position-horizontal:absolute;mso-position-horizontal-relative:page;mso-position-vertical:absolute;mso-position-vertical-relative:page;v-text-anchor:top" coordsize="6120130,1270" o:gfxdata="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" path="m,l6120130,e" filled="f" strokeweight="1.5pt">
+            <v:shape w14:anchorId="4EB58100" id="Graphic 56" o:spid="_x0000_s1026" style="position:absolute;margin-left:56.7pt;margin-top:103.65pt;width:481.9pt;height:.1pt;z-index:-251645952;visibility:visible;mso-wrap-style:square;mso-wrap-distance-left:0;mso-wrap-distance-top:0;mso-wrap-distance-right:0;mso-wrap-distance-bottom:0;mso-position-horizontal:absolute;mso-position-horizontal-relative:page;mso-position-vertical:absolute;mso-position-vertical-relative:page;v-text-anchor:top" coordsize="6120130,1270" o:gfxdata="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" path="m,l6120130,e" filled="f" strokeweight="1.5pt">
               <v:path arrowok="t"/>
               <w10:wrap anchorx="page" anchory="page"/>
             </v:shape>

</xml_diff>

<commit_message>
Jobsheet 4 (Langkah 4 – Optional Catch-All Route)
</commit_message>
<xml_diff>
--- a/Laporan/20_Satrio Wisnu Adi Pratama_Jobsheet 4.docx
+++ b/Laporan/20_Satrio Wisnu Adi Pratama_Jobsheet 4.docx
@@ -95,7 +95,7 @@
           </mc:Choice>
           <mc:Fallback>
             <w:pict>
-              <v:shape w14:anchorId="72A52A08" id="Graphic 7" o:spid="_x0000_s1026" style="position:absolute;margin-left:56.7pt;margin-top:55.9pt;width:481.9pt;height:.1pt;z-index:251658240;visibility:visible;mso-wrap-style:square;mso-wrap-distance-left:0;mso-wrap-distance-top:0;mso-wrap-distance-right:0;mso-wrap-distance-bottom:0;mso-position-horizontal:absolute;mso-position-horizontal-relative:page;mso-position-vertical:absolute;mso-position-vertical-relative:text;v-text-anchor:top" coordsize="6120130,1270" o:gfxdata="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" path="m,l6120130,e" filled="f" strokeweight=".5pt">
+              <v:shape w14:anchorId="2C84A173" id="Graphic 7" o:spid="_x0000_s1026" style="position:absolute;margin-left:56.7pt;margin-top:55.9pt;width:481.9pt;height:.1pt;z-index:251658240;visibility:visible;mso-wrap-style:square;mso-wrap-distance-left:0;mso-wrap-distance-top:0;mso-wrap-distance-right:0;mso-wrap-distance-bottom:0;mso-position-horizontal:absolute;mso-position-horizontal-relative:page;mso-position-vertical:absolute;mso-position-vertical-relative:text;v-text-anchor:top" coordsize="6120130,1270" o:gfxdata="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" path="m,l6120130,e" filled="f" strokeweight=".5pt">
                 <v:path arrowok="t"/>
                 <w10:wrap anchorx="page"/>
               </v:shape>
@@ -1489,7 +1489,6 @@
             </w:r>
           </w:p>
           <w:p>
-            <w:bookmarkStart w:id="0" w:name="_GoBack"/>
             <w:r>
               <w:drawing>
                 <wp:inline distT="0" distB="0" distL="0" distR="0" wp14:anchorId="188262F5" wp14:editId="0A546B58">
@@ -1527,7 +1526,6 @@
                 </wp:inline>
               </w:drawing>
             </w:r>
-            <w:bookmarkEnd w:id="0"/>
           </w:p>
           <w:p>
             <w:r>
@@ -1587,12 +1585,173 @@
           </w:p>
           <w:p>
             <w:r>
+              <w:drawing>
+                <wp:inline distT="0" distB="0" distL="0" distR="0" wp14:anchorId="63710547" wp14:editId="6CB7E88C">
+                  <wp:extent cx="5716058" cy="1205196"/>
+                  <wp:effectExtent l="0" t="0" r="0" b="0"/>
+                  <wp:docPr id="15" name="Picture 15"/>
+                  <wp:cNvGraphicFramePr>
+                    <a:graphicFrameLocks xmlns:a="http://schemas.openxmlformats.org/drawingml/2006/main" noChangeAspect="1"/>
+                  </wp:cNvGraphicFramePr>
+                  <a:graphic xmlns:a="http://schemas.openxmlformats.org/drawingml/2006/main">
+                    <a:graphicData uri="http://schemas.openxmlformats.org/drawingml/2006/picture">
+                      <pic:pic xmlns:pic="http://schemas.openxmlformats.org/drawingml/2006/picture">
+                        <pic:nvPicPr>
+                          <pic:cNvPr id="1" name=""/>
+                          <pic:cNvPicPr/>
+                        </pic:nvPicPr>
+                        <pic:blipFill>
+                          <a:blip r:embed="rId19"/>
+                          <a:stretch>
+                            <a:fillRect/>
+                          </a:stretch>
+                        </pic:blipFill>
+                        <pic:spPr>
+                          <a:xfrm>
+                            <a:off x="0" y="0"/>
+                            <a:ext cx="5820120" cy="1227137"/>
+                          </a:xfrm>
+                          <a:prstGeom prst="rect">
+                            <a:avLst/>
+                          </a:prstGeom>
+                        </pic:spPr>
+                      </pic:pic>
+                    </a:graphicData>
+                  </a:graphic>
+                </wp:inline>
+              </w:drawing>
+            </w:r>
+          </w:p>
+          <w:p>
+            <w:r>
               <w:t>Jalankan browser : Berapapun banyaknya seqment tetap terbaca</w:t>
             </w:r>
           </w:p>
           <w:p>
             <w:r>
-              <w:t xml:space="preserve">Untuk saat ini gunakan Perhatikan bahwa: </w:t>
+              <w:drawing>
+                <wp:inline distT="0" distB="0" distL="0" distR="0" wp14:anchorId="65BBFDB0" wp14:editId="079F8CBD">
+                  <wp:extent cx="3576855" cy="1829858"/>
+                  <wp:effectExtent l="0" t="0" r="5080" b="0"/>
+                  <wp:docPr id="16" name="Picture 16"/>
+                  <wp:cNvGraphicFramePr>
+                    <a:graphicFrameLocks xmlns:a="http://schemas.openxmlformats.org/drawingml/2006/main" noChangeAspect="1"/>
+                  </wp:cNvGraphicFramePr>
+                  <a:graphic xmlns:a="http://schemas.openxmlformats.org/drawingml/2006/main">
+                    <a:graphicData uri="http://schemas.openxmlformats.org/drawingml/2006/picture">
+                      <pic:pic xmlns:pic="http://schemas.openxmlformats.org/drawingml/2006/picture">
+                        <pic:nvPicPr>
+                          <pic:cNvPr id="1" name=""/>
+                          <pic:cNvPicPr/>
+                        </pic:nvPicPr>
+                        <pic:blipFill>
+                          <a:blip r:embed="rId20"/>
+                          <a:stretch>
+                            <a:fillRect/>
+                          </a:stretch>
+                        </pic:blipFill>
+                        <pic:spPr>
+                          <a:xfrm>
+                            <a:off x="0" y="0"/>
+                            <a:ext cx="3670351" cy="1877689"/>
+                          </a:xfrm>
+                          <a:prstGeom prst="rect">
+                            <a:avLst/>
+                          </a:prstGeom>
+                        </pic:spPr>
+                      </pic:pic>
+                    </a:graphicData>
+                  </a:graphic>
+                </wp:inline>
+              </w:drawing>
+            </w:r>
+          </w:p>
+          <w:p>
+            <w:r>
+              <w:drawing>
+                <wp:inline distT="0" distB="0" distL="0" distR="0" wp14:anchorId="064A661D" wp14:editId="410D1D43">
+                  <wp:extent cx="3571904" cy="1833668"/>
+                  <wp:effectExtent l="0" t="0" r="0" b="0"/>
+                  <wp:docPr id="17" name="Picture 17"/>
+                  <wp:cNvGraphicFramePr>
+                    <a:graphicFrameLocks xmlns:a="http://schemas.openxmlformats.org/drawingml/2006/main" noChangeAspect="1"/>
+                  </wp:cNvGraphicFramePr>
+                  <a:graphic xmlns:a="http://schemas.openxmlformats.org/drawingml/2006/main">
+                    <a:graphicData uri="http://schemas.openxmlformats.org/drawingml/2006/picture">
+                      <pic:pic xmlns:pic="http://schemas.openxmlformats.org/drawingml/2006/picture">
+                        <pic:nvPicPr>
+                          <pic:cNvPr id="1" name=""/>
+                          <pic:cNvPicPr/>
+                        </pic:nvPicPr>
+                        <pic:blipFill>
+                          <a:blip r:embed="rId21"/>
+                          <a:stretch>
+                            <a:fillRect/>
+                          </a:stretch>
+                        </pic:blipFill>
+                        <pic:spPr>
+                          <a:xfrm>
+                            <a:off x="0" y="0"/>
+                            <a:ext cx="3609111" cy="1852768"/>
+                          </a:xfrm>
+                          <a:prstGeom prst="rect">
+                            <a:avLst/>
+                          </a:prstGeom>
+                        </pic:spPr>
+                      </pic:pic>
+                    </a:graphicData>
+                  </a:graphic>
+                </wp:inline>
+              </w:drawing>
+            </w:r>
+          </w:p>
+          <w:p>
+            <w:r>
+              <w:t xml:space="preserve">Untuk saat ini gunakan </w:t>
+            </w:r>
+          </w:p>
+          <w:p>
+            <w:r>
+              <w:drawing>
+                <wp:inline distT="0" distB="0" distL="0" distR="0" wp14:anchorId="3C52B200" wp14:editId="0161B82E">
+                  <wp:extent cx="5783792" cy="1117115"/>
+                  <wp:effectExtent l="0" t="0" r="7620" b="6985"/>
+                  <wp:docPr id="18" name="Picture 18"/>
+                  <wp:cNvGraphicFramePr>
+                    <a:graphicFrameLocks xmlns:a="http://schemas.openxmlformats.org/drawingml/2006/main" noChangeAspect="1"/>
+                  </wp:cNvGraphicFramePr>
+                  <a:graphic xmlns:a="http://schemas.openxmlformats.org/drawingml/2006/main">
+                    <a:graphicData uri="http://schemas.openxmlformats.org/drawingml/2006/picture">
+                      <pic:pic xmlns:pic="http://schemas.openxmlformats.org/drawingml/2006/picture">
+                        <pic:nvPicPr>
+                          <pic:cNvPr id="1" name=""/>
+                          <pic:cNvPicPr/>
+                        </pic:nvPicPr>
+                        <pic:blipFill>
+                          <a:blip r:embed="rId22"/>
+                          <a:stretch>
+                            <a:fillRect/>
+                          </a:stretch>
+                        </pic:blipFill>
+                        <pic:spPr>
+                          <a:xfrm>
+                            <a:off x="0" y="0"/>
+                            <a:ext cx="5840415" cy="1128051"/>
+                          </a:xfrm>
+                          <a:prstGeom prst="rect">
+                            <a:avLst/>
+                          </a:prstGeom>
+                        </pic:spPr>
+                      </pic:pic>
+                    </a:graphicData>
+                  </a:graphic>
+                </wp:inline>
+              </w:drawing>
+            </w:r>
+          </w:p>
+          <w:p>
+            <w:r>
+              <w:t xml:space="preserve">Perhatikan bahwa: </w:t>
             </w:r>
           </w:p>
           <w:p>
@@ -1619,9 +1778,22 @@
               <w:t>Isi halaman berubah sesuai URL</w:t>
             </w:r>
           </w:p>
+          <w:p>
+            <w:pPr>
+              <w:pStyle w:val="ListParagraph"/>
+              <w:ind w:left="720"/>
+            </w:pPr>
+          </w:p>
         </w:tc>
       </w:tr>
     </w:tbl>
+    <w:p/>
+    <w:p/>
+    <w:p/>
+    <w:p/>
+    <w:p/>
+    <w:p/>
+    <w:p/>
     <w:p/>
     <w:p>
       <w:pPr>
@@ -1718,6 +1890,45 @@
               <w:t xml:space="preserve">Jika menggunakan [...slug].js maka ketika mengakses shop akan terjadi error </w:t>
             </w:r>
           </w:p>
+          <w:p>
+            <w:r>
+              <w:drawing>
+                <wp:inline distT="0" distB="0" distL="0" distR="0" wp14:anchorId="27F0600F" wp14:editId="4AE723D6">
+                  <wp:extent cx="3158067" cy="3743114"/>
+                  <wp:effectExtent l="0" t="0" r="4445" b="0"/>
+                  <wp:docPr id="19" name="Picture 19"/>
+                  <wp:cNvGraphicFramePr>
+                    <a:graphicFrameLocks xmlns:a="http://schemas.openxmlformats.org/drawingml/2006/main" noChangeAspect="1"/>
+                  </wp:cNvGraphicFramePr>
+                  <a:graphic xmlns:a="http://schemas.openxmlformats.org/drawingml/2006/main">
+                    <a:graphicData uri="http://schemas.openxmlformats.org/drawingml/2006/picture">
+                      <pic:pic xmlns:pic="http://schemas.openxmlformats.org/drawingml/2006/picture">
+                        <pic:nvPicPr>
+                          <pic:cNvPr id="1" name=""/>
+                          <pic:cNvPicPr/>
+                        </pic:nvPicPr>
+                        <pic:blipFill>
+                          <a:blip r:embed="rId23"/>
+                          <a:stretch>
+                            <a:fillRect/>
+                          </a:stretch>
+                        </pic:blipFill>
+                        <pic:spPr>
+                          <a:xfrm>
+                            <a:off x="0" y="0"/>
+                            <a:ext cx="3234450" cy="3833647"/>
+                          </a:xfrm>
+                          <a:prstGeom prst="rect">
+                            <a:avLst/>
+                          </a:prstGeom>
+                        </pic:spPr>
+                      </pic:pic>
+                    </a:graphicData>
+                  </a:graphic>
+                </wp:inline>
+              </w:drawing>
+            </w:r>
+          </w:p>
         </w:tc>
       </w:tr>
       <w:tr>
@@ -1743,6 +1954,46 @@
               <w:t xml:space="preserve">Solusinya dengan Rename file: [...slug].js → [[...slug]].js </w:t>
             </w:r>
           </w:p>
+          <w:p>
+            <w:r>
+              <w:drawing>
+                <wp:inline distT="0" distB="0" distL="0" distR="0" wp14:anchorId="1F409D92" wp14:editId="5B3C8472">
+                  <wp:extent cx="3234267" cy="1074802"/>
+                  <wp:effectExtent l="0" t="0" r="4445" b="0"/>
+                  <wp:docPr id="21" name="Picture 21"/>
+                  <wp:cNvGraphicFramePr>
+                    <a:graphicFrameLocks xmlns:a="http://schemas.openxmlformats.org/drawingml/2006/main" noChangeAspect="1"/>
+                  </wp:cNvGraphicFramePr>
+                  <a:graphic xmlns:a="http://schemas.openxmlformats.org/drawingml/2006/main">
+                    <a:graphicData uri="http://schemas.openxmlformats.org/drawingml/2006/picture">
+                      <pic:pic xmlns:pic="http://schemas.openxmlformats.org/drawingml/2006/picture">
+                        <pic:nvPicPr>
+                          <pic:cNvPr id="1" name=""/>
+                          <pic:cNvPicPr/>
+                        </pic:nvPicPr>
+                        <pic:blipFill>
+                          <a:blip r:embed="rId24"/>
+                          <a:stretch>
+                            <a:fillRect/>
+                          </a:stretch>
+                        </pic:blipFill>
+                        <pic:spPr>
+                          <a:xfrm>
+                            <a:off x="0" y="0"/>
+                            <a:ext cx="3293813" cy="1094590"/>
+                          </a:xfrm>
+                          <a:prstGeom prst="rect">
+                            <a:avLst/>
+                          </a:prstGeom>
+                        </pic:spPr>
+                      </pic:pic>
+                    </a:graphicData>
+                  </a:graphic>
+                </wp:inline>
+              </w:drawing>
+            </w:r>
+          </w:p>
+          <w:p/>
         </w:tc>
       </w:tr>
       <w:tr>
@@ -1773,6 +2024,46 @@
               <w:t xml:space="preserve">/shop </w:t>
             </w:r>
           </w:p>
+          <w:p>
+            <w:r>
+              <w:drawing>
+                <wp:inline distT="0" distB="0" distL="0" distR="0" wp14:anchorId="055037E6" wp14:editId="0C42C290">
+                  <wp:extent cx="3285067" cy="1695720"/>
+                  <wp:effectExtent l="0" t="0" r="0" b="0"/>
+                  <wp:docPr id="20" name="Picture 20"/>
+                  <wp:cNvGraphicFramePr>
+                    <a:graphicFrameLocks xmlns:a="http://schemas.openxmlformats.org/drawingml/2006/main" noChangeAspect="1"/>
+                  </wp:cNvGraphicFramePr>
+                  <a:graphic xmlns:a="http://schemas.openxmlformats.org/drawingml/2006/main">
+                    <a:graphicData uri="http://schemas.openxmlformats.org/drawingml/2006/picture">
+                      <pic:pic xmlns:pic="http://schemas.openxmlformats.org/drawingml/2006/picture">
+                        <pic:nvPicPr>
+                          <pic:cNvPr id="1" name=""/>
+                          <pic:cNvPicPr/>
+                        </pic:nvPicPr>
+                        <pic:blipFill>
+                          <a:blip r:embed="rId25"/>
+                          <a:stretch>
+                            <a:fillRect/>
+                          </a:stretch>
+                        </pic:blipFill>
+                        <pic:spPr>
+                          <a:xfrm>
+                            <a:off x="0" y="0"/>
+                            <a:ext cx="3340073" cy="1724114"/>
+                          </a:xfrm>
+                          <a:prstGeom prst="rect">
+                            <a:avLst/>
+                          </a:prstGeom>
+                        </pic:spPr>
+                      </pic:pic>
+                    </a:graphicData>
+                  </a:graphic>
+                </wp:inline>
+              </w:drawing>
+            </w:r>
+          </w:p>
+          <w:p/>
         </w:tc>
       </w:tr>
       <w:tr>
@@ -1810,6 +2101,8 @@
           <w:color w:val="auto"/>
         </w:rPr>
       </w:pPr>
+      <w:bookmarkStart w:id="0" w:name="_GoBack"/>
+      <w:bookmarkEnd w:id="0"/>
       <w:r>
         <w:rPr>
           <w:rFonts w:ascii="Times New Roman" w:hAnsi="Times New Roman" w:cs="Times New Roman"/>
@@ -1903,95 +2196,13 @@
                 <w:lang w:val="en-ID" w:eastAsia="en-ID"/>
               </w:rPr>
             </w:pPr>
-            <w:proofErr w:type="spellStart"/>
             <w:r>
               <w:rPr>
                 <w:sz w:val="24"/>
                 <w:szCs w:val="24"/>
                 <w:lang w:val="en-ID" w:eastAsia="en-ID"/>
               </w:rPr>
-              <w:t>Tambahkan</w:t>
-            </w:r>
-            <w:proofErr w:type="spellEnd"/>
-            <w:r>
-              <w:rPr>
-                <w:sz w:val="24"/>
-                <w:szCs w:val="24"/>
-                <w:lang w:val="en-ID" w:eastAsia="en-ID"/>
-              </w:rPr>
-              <w:t xml:space="preserve"> </w:t>
-            </w:r>
-            <w:proofErr w:type="spellStart"/>
-            <w:r>
-              <w:rPr>
-                <w:sz w:val="24"/>
-                <w:szCs w:val="24"/>
-                <w:lang w:val="en-ID" w:eastAsia="en-ID"/>
-              </w:rPr>
-              <w:t>validasi</w:t>
-            </w:r>
-            <w:proofErr w:type="spellEnd"/>
-            <w:r>
-              <w:rPr>
-                <w:sz w:val="24"/>
-                <w:szCs w:val="24"/>
-                <w:lang w:val="en-ID" w:eastAsia="en-ID"/>
-              </w:rPr>
-              <w:t xml:space="preserve"> agar </w:t>
-            </w:r>
-            <w:proofErr w:type="spellStart"/>
-            <w:r>
-              <w:rPr>
-                <w:sz w:val="24"/>
-                <w:szCs w:val="24"/>
-                <w:lang w:val="en-ID" w:eastAsia="en-ID"/>
-              </w:rPr>
-              <w:t>tidak</w:t>
-            </w:r>
-            <w:proofErr w:type="spellEnd"/>
-            <w:r>
-              <w:rPr>
-                <w:sz w:val="24"/>
-                <w:szCs w:val="24"/>
-                <w:lang w:val="en-ID" w:eastAsia="en-ID"/>
-              </w:rPr>
-              <w:t xml:space="preserve"> error </w:t>
-            </w:r>
-            <w:proofErr w:type="spellStart"/>
-            <w:r>
-              <w:rPr>
-                <w:sz w:val="24"/>
-                <w:szCs w:val="24"/>
-                <w:lang w:val="en-ID" w:eastAsia="en-ID"/>
-              </w:rPr>
-              <w:t>saat</w:t>
-            </w:r>
-            <w:proofErr w:type="spellEnd"/>
-            <w:r>
-              <w:rPr>
-                <w:sz w:val="24"/>
-                <w:szCs w:val="24"/>
-                <w:lang w:val="en-ID" w:eastAsia="en-ID"/>
-              </w:rPr>
-              <w:t xml:space="preserve"> slug </w:t>
-            </w:r>
-            <w:proofErr w:type="spellStart"/>
-            <w:r>
-              <w:rPr>
-                <w:sz w:val="24"/>
-                <w:szCs w:val="24"/>
-                <w:lang w:val="en-ID" w:eastAsia="en-ID"/>
-              </w:rPr>
-              <w:t>kosong</w:t>
-            </w:r>
-            <w:proofErr w:type="spellEnd"/>
-            <w:r>
-              <w:rPr>
-                <w:sz w:val="24"/>
-                <w:szCs w:val="24"/>
-                <w:lang w:val="en-ID" w:eastAsia="en-ID"/>
-              </w:rPr>
-              <w:t xml:space="preserve">: </w:t>
+              <w:t xml:space="preserve">Tambahkan validasi agar tidak error saat slug kosong: </w:t>
             </w:r>
           </w:p>
           <w:p>
@@ -2025,23 +2236,13 @@
                 <w:lang w:val="en-ID" w:eastAsia="en-ID"/>
               </w:rPr>
             </w:pPr>
-            <w:proofErr w:type="spellStart"/>
             <w:r>
               <w:rPr>
                 <w:sz w:val="24"/>
                 <w:szCs w:val="24"/>
                 <w:lang w:val="en-ID" w:eastAsia="en-ID"/>
               </w:rPr>
-              <w:t>Kategori</w:t>
-            </w:r>
-            <w:proofErr w:type="spellEnd"/>
-            <w:r>
-              <w:rPr>
-                <w:sz w:val="24"/>
-                <w:szCs w:val="24"/>
-                <w:lang w:val="en-ID" w:eastAsia="en-ID"/>
-              </w:rPr>
-              <w:t>: {</w:t>
+              <w:t>Kategori: {</w:t>
             </w:r>
             <w:proofErr w:type="gramStart"/>
             <w:r>
@@ -2059,43 +2260,7 @@
                 <w:szCs w:val="24"/>
                 <w:lang w:val="en-ID" w:eastAsia="en-ID"/>
               </w:rPr>
-              <w:t xml:space="preserve"> slug[0] : "</w:t>
-            </w:r>
-            <w:proofErr w:type="spellStart"/>
-            <w:r>
-              <w:rPr>
-                <w:sz w:val="24"/>
-                <w:szCs w:val="24"/>
-                <w:lang w:val="en-ID" w:eastAsia="en-ID"/>
-              </w:rPr>
-              <w:t>Semua</w:t>
-            </w:r>
-            <w:proofErr w:type="spellEnd"/>
-            <w:r>
-              <w:rPr>
-                <w:sz w:val="24"/>
-                <w:szCs w:val="24"/>
-                <w:lang w:val="en-ID" w:eastAsia="en-ID"/>
-              </w:rPr>
-              <w:t xml:space="preserve"> </w:t>
-            </w:r>
-            <w:proofErr w:type="spellStart"/>
-            <w:r>
-              <w:rPr>
-                <w:sz w:val="24"/>
-                <w:szCs w:val="24"/>
-                <w:lang w:val="en-ID" w:eastAsia="en-ID"/>
-              </w:rPr>
-              <w:t>Kategori</w:t>
-            </w:r>
-            <w:proofErr w:type="spellEnd"/>
-            <w:r>
-              <w:rPr>
-                <w:sz w:val="24"/>
-                <w:szCs w:val="24"/>
-                <w:lang w:val="en-ID" w:eastAsia="en-ID"/>
-              </w:rPr>
-              <w:t xml:space="preserve">"} </w:t>
+              <w:t xml:space="preserve"> slug[0] : "Semua Kategori"} </w:t>
             </w:r>
           </w:p>
           <w:p>
@@ -2498,7 +2663,6 @@
           <w:rFonts w:ascii="Times New Roman" w:hAnsi="Times New Roman" w:cs="Times New Roman"/>
           <w:color w:val="auto"/>
         </w:rPr>
-        <w:lastRenderedPageBreak/>
         <w:t>Langkah 8 – Simulasi Redirect (Belum Login)</w:t>
       </w:r>
     </w:p>
@@ -2780,6 +2944,7 @@
               </w:numPr>
             </w:pPr>
             <w:r>
+              <w:lastRenderedPageBreak/>
               <w:t xml:space="preserve">Login → Product (imperatif) </w:t>
             </w:r>
           </w:p>
@@ -2807,6 +2972,7 @@
               <w:jc w:val="center"/>
             </w:pPr>
             <w:r>
+              <w:lastRenderedPageBreak/>
               <w:t>3</w:t>
             </w:r>
           </w:p>
@@ -3024,8 +3190,8 @@
       </w:pPr>
     </w:p>
     <w:sectPr>
-      <w:headerReference w:type="default" r:id="rId19"/>
-      <w:footerReference w:type="default" r:id="rId20"/>
+      <w:headerReference w:type="default" r:id="rId26"/>
+      <w:footerReference w:type="default" r:id="rId27"/>
       <w:pgSz w:w="11900" w:h="16820"/>
       <w:pgMar w:top="2080" w:right="1133" w:bottom="1060" w:left="992" w:header="567" w:footer="753" w:gutter="0"/>
       <w:cols w:space="720"/>
@@ -3135,7 +3301,7 @@
         </mc:Choice>
         <mc:Fallback>
           <w:pict>
-            <v:shape w14:anchorId="428FCC9B" id="Graphic 58" o:spid="_x0000_s1026" style="position:absolute;margin-left:56.7pt;margin-top:784.15pt;width:481.9pt;height:.1pt;z-index:-251643904;visibility:visible;mso-wrap-style:square;mso-wrap-distance-left:0;mso-wrap-distance-top:0;mso-wrap-distance-right:0;mso-wrap-distance-bottom:0;mso-position-horizontal:absolute;mso-position-horizontal-relative:page;mso-position-vertical:absolute;mso-position-vertical-relative:page;v-text-anchor:top" coordsize="6120130,1270" o:gfxdata="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" path="m,l6120130,e" filled="f">
+            <v:shape w14:anchorId="6E68CA81" id="Graphic 58" o:spid="_x0000_s1026" style="position:absolute;margin-left:56.7pt;margin-top:784.15pt;width:481.9pt;height:.1pt;z-index:-251643904;visibility:visible;mso-wrap-style:square;mso-wrap-distance-left:0;mso-wrap-distance-top:0;mso-wrap-distance-right:0;mso-wrap-distance-bottom:0;mso-position-horizontal:absolute;mso-position-horizontal-relative:page;mso-position-vertical:absolute;mso-position-vertical-relative:page;v-text-anchor:top" coordsize="6120130,1270" o:gfxdata="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" path="m,l6120130,e" filled="f">
               <v:path arrowok="t"/>
               <w10:wrap anchorx="page" anchory="page"/>
             </v:shape>
@@ -3740,7 +3906,7 @@
         </mc:Choice>
         <mc:Fallback>
           <w:pict>
-            <v:shape w14:anchorId="651A05E8" id="Graphic 56" o:spid="_x0000_s1026" style="position:absolute;margin-left:56.7pt;margin-top:103.65pt;width:481.9pt;height:.1pt;z-index:-251645952;visibility:visible;mso-wrap-style:square;mso-wrap-distance-left:0;mso-wrap-distance-top:0;mso-wrap-distance-right:0;mso-wrap-distance-bottom:0;mso-position-horizontal:absolute;mso-position-horizontal-relative:page;mso-position-vertical:absolute;mso-position-vertical-relative:page;v-text-anchor:top" coordsize="6120130,1270" o:gfxdata="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" path="m,l6120130,e" filled="f" strokeweight="1.5pt">
+            <v:shape w14:anchorId="1CF1A623" id="Graphic 56" o:spid="_x0000_s1026" style="position:absolute;margin-left:56.7pt;margin-top:103.65pt;width:481.9pt;height:.1pt;z-index:-251645952;visibility:visible;mso-wrap-style:square;mso-wrap-distance-left:0;mso-wrap-distance-top:0;mso-wrap-distance-right:0;mso-wrap-distance-bottom:0;mso-position-horizontal:absolute;mso-position-horizontal-relative:page;mso-position-vertical:absolute;mso-position-vertical-relative:page;v-text-anchor:top" coordsize="6120130,1270" o:gfxdata="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" path="m,l6120130,e" filled="f" strokeweight="1.5pt">
               <v:path arrowok="t"/>
               <w10:wrap anchorx="page" anchory="page"/>
             </v:shape>

</xml_diff>